<commit_message>
On branch master Your branch is up to date with 'origin/master'.
Changes to be committed:
	modified:   other/Land_record/Surwal/docx/Surwal_land_details-hindi.docx
	modified:   other/Land_record/Surwal/docx/Surwal_land_details.docx
	modified:   other/Land_record/Surwal/pdf/Surwal_land_details-hindi.pdf
	modified:   other/Land_record/Surwal/pdf/Surwal_land_details.pdf
</commit_message>
<xml_diff>
--- a/other/Land_record/Surwal/docx/Surwal_land_details.docx
+++ b/other/Land_record/Surwal/docx/Surwal_land_details.docx
@@ -34,7 +34,6 @@
         </w:rPr>
         <w:t xml:space="preserve">: </w:t>
       </w:r>
-      <w:proofErr w:type="spellStart"/>
       <w:r>
         <w:rPr>
           <w:rFonts w:ascii="Arial Black" w:hAnsi="Arial Black" w:cs="Nirmala UI"/>
@@ -45,7 +44,6 @@
         </w:rPr>
         <w:t>Surwal</w:t>
       </w:r>
-      <w:proofErr w:type="spellEnd"/>
       <w:r>
         <w:rPr>
           <w:rFonts w:ascii="Arial Black" w:hAnsi="Arial Black"/>
@@ -849,6 +847,9 @@
     <w:p>
       <w:pPr>
         <w:rPr>
+          <w:rFonts w:ascii="Arial Black" w:hAnsi="Arial Black"/>
+          <w:b/>
+          <w:bCs/>
           <w:sz w:val="28"/>
           <w:szCs w:val="28"/>
         </w:rPr>
@@ -896,6 +897,38 @@
           <w:sz w:val="28"/>
           <w:szCs w:val="28"/>
         </w:rPr>
+        <w:t>2006/2312:</w:t>
+      </w:r>
+      <w:r>
+        <w:rPr>
+          <w:sz w:val="28"/>
+          <w:szCs w:val="28"/>
+        </w:rPr>
+        <w:t xml:space="preserve"> 2 katha, 03 dhur (Riyasat Miyan se vainama liya gaya)</w:t>
+      </w:r>
+    </w:p>
+    <w:p>
+      <w:pPr>
+        <w:rPr>
+          <w:sz w:val="28"/>
+          <w:szCs w:val="28"/>
+        </w:rPr>
+      </w:pPr>
+    </w:p>
+    <w:p>
+      <w:pPr>
+        <w:rPr>
+          <w:sz w:val="28"/>
+          <w:szCs w:val="28"/>
+        </w:rPr>
+      </w:pPr>
+      <w:r>
+        <w:rPr>
+          <w:b/>
+          <w:bCs/>
+          <w:sz w:val="28"/>
+          <w:szCs w:val="28"/>
+        </w:rPr>
         <w:t>395:</w:t>
       </w:r>
       <w:r>
@@ -1300,12 +1333,38 @@
       </w:r>
       <w:r>
         <w:rPr>
-          <w:b/>
-          <w:bCs/>
+          <w:rFonts w:ascii="Arial Black" w:hAnsi="Arial Black" w:cs="Nirmala UI"/>
           <w:sz w:val="28"/>
           <w:szCs w:val="28"/>
         </w:rPr>
         <w:lastRenderedPageBreak/>
+        <w:t>Khata</w:t>
+      </w:r>
+      <w:r>
+        <w:rPr>
+          <w:rFonts w:ascii="Arial Black" w:hAnsi="Arial Black"/>
+          <w:b/>
+          <w:bCs/>
+          <w:sz w:val="28"/>
+          <w:szCs w:val="28"/>
+        </w:rPr>
+        <w:t>-145:</w:t>
+      </w:r>
+    </w:p>
+    <w:p>
+      <w:pPr>
+        <w:rPr>
+          <w:sz w:val="28"/>
+          <w:szCs w:val="28"/>
+        </w:rPr>
+      </w:pPr>
+      <w:r>
+        <w:rPr>
+          <w:b/>
+          <w:bCs/>
+          <w:sz w:val="28"/>
+          <w:szCs w:val="28"/>
+        </w:rPr>
         <w:t>578:</w:t>
       </w:r>
       <w:r>
@@ -1433,10 +1492,453 @@
       </w:pPr>
       <w:r>
         <w:rPr>
+          <w:b/>
+          <w:bCs/>
+          <w:sz w:val="28"/>
+          <w:szCs w:val="28"/>
+        </w:rPr>
+        <w:t>585:</w:t>
+      </w:r>
+      <w:r>
+        <w:rPr>
+          <w:sz w:val="28"/>
+          <w:szCs w:val="28"/>
+        </w:rPr>
+        <w:t xml:space="preserve"> 2 katha, 19 dhur = 11 dismil</w:t>
+      </w:r>
+    </w:p>
+    <w:p>
+      <w:pPr>
+        <w:ind w:left="720"/>
+        <w:rPr>
+          <w:sz w:val="28"/>
+          <w:szCs w:val="28"/>
+        </w:rPr>
+      </w:pPr>
+      <w:r>
+        <w:rPr>
+          <w:b/>
+          <w:bCs/>
+          <w:sz w:val="28"/>
+          <w:szCs w:val="28"/>
+        </w:rPr>
+        <w:t>N:</w:t>
+      </w:r>
+      <w:r>
+        <w:rPr>
+          <w:sz w:val="28"/>
+          <w:szCs w:val="28"/>
+        </w:rPr>
+        <w:t xml:space="preserve"> Vaka</w:t>
+      </w:r>
+      <w:r>
+        <w:rPr>
+          <w:sz w:val="28"/>
+          <w:szCs w:val="28"/>
+        </w:rPr>
+        <w:t>a</w:t>
+      </w:r>
+      <w:r>
+        <w:rPr>
+          <w:sz w:val="28"/>
+          <w:szCs w:val="28"/>
+        </w:rPr>
+        <w:t>sh Malikan</w:t>
+      </w:r>
+    </w:p>
+    <w:p>
+      <w:pPr>
+        <w:ind w:left="720"/>
+        <w:rPr>
+          <w:sz w:val="28"/>
+          <w:szCs w:val="28"/>
+        </w:rPr>
+      </w:pPr>
+      <w:r>
+        <w:rPr>
+          <w:b/>
+          <w:bCs/>
+          <w:sz w:val="28"/>
+          <w:szCs w:val="28"/>
+        </w:rPr>
+        <w:t>S:</w:t>
+      </w:r>
+      <w:r>
+        <w:rPr>
+          <w:sz w:val="28"/>
+          <w:szCs w:val="28"/>
+        </w:rPr>
+        <w:t xml:space="preserve"> Fatigan Miyan</w:t>
+      </w:r>
+    </w:p>
+    <w:p>
+      <w:pPr>
+        <w:ind w:left="720"/>
+        <w:rPr>
+          <w:sz w:val="28"/>
+          <w:szCs w:val="28"/>
+        </w:rPr>
+      </w:pPr>
+      <w:r>
+        <w:rPr>
+          <w:b/>
+          <w:bCs/>
+          <w:sz w:val="28"/>
+          <w:szCs w:val="28"/>
+        </w:rPr>
+        <w:t>E:</w:t>
+      </w:r>
+      <w:r>
+        <w:rPr>
+          <w:sz w:val="28"/>
+          <w:szCs w:val="28"/>
+        </w:rPr>
+        <w:t xml:space="preserve"> Dukhi Miyan</w:t>
+      </w:r>
+    </w:p>
+    <w:p>
+      <w:pPr>
+        <w:ind w:left="720"/>
+        <w:rPr>
+          <w:sz w:val="28"/>
+          <w:szCs w:val="28"/>
+        </w:rPr>
+      </w:pPr>
+      <w:r>
+        <w:rPr>
+          <w:b/>
+          <w:bCs/>
+          <w:sz w:val="28"/>
+          <w:szCs w:val="28"/>
+        </w:rPr>
+        <w:t>W:</w:t>
+      </w:r>
+      <w:r>
+        <w:rPr>
+          <w:sz w:val="28"/>
+          <w:szCs w:val="28"/>
+        </w:rPr>
+        <w:t xml:space="preserve"> Jagdev Tiwari</w:t>
+      </w:r>
+    </w:p>
+    <w:p>
+      <w:pPr>
+        <w:ind w:left="720"/>
+        <w:rPr>
+          <w:rFonts w:ascii="Arial Black" w:hAnsi="Arial Black"/>
+          <w:b/>
+          <w:bCs/>
+          <w:sz w:val="28"/>
+          <w:szCs w:val="28"/>
+        </w:rPr>
+      </w:pPr>
+    </w:p>
+    <w:p>
+      <w:pPr>
+        <w:rPr>
+          <w:sz w:val="28"/>
+          <w:szCs w:val="28"/>
+        </w:rPr>
+      </w:pPr>
+      <w:r>
+        <w:rPr>
+          <w:b/>
+          <w:bCs/>
+          <w:sz w:val="28"/>
+          <w:szCs w:val="28"/>
+        </w:rPr>
+        <w:t>633:</w:t>
+      </w:r>
+      <w:r>
+        <w:rPr>
+          <w:sz w:val="28"/>
+          <w:szCs w:val="28"/>
+        </w:rPr>
+        <w:t xml:space="preserve"> 3 katha, 15 dhur = 14 dismil</w:t>
+      </w:r>
+    </w:p>
+    <w:p>
+      <w:pPr>
+        <w:ind w:left="720"/>
+        <w:rPr>
+          <w:sz w:val="28"/>
+          <w:szCs w:val="28"/>
+        </w:rPr>
+      </w:pPr>
+      <w:r>
+        <w:rPr>
+          <w:b/>
+          <w:bCs/>
+          <w:sz w:val="28"/>
+          <w:szCs w:val="28"/>
+        </w:rPr>
+        <w:t>N:</w:t>
+      </w:r>
+      <w:r>
+        <w:rPr>
+          <w:sz w:val="28"/>
+          <w:szCs w:val="28"/>
+        </w:rPr>
+        <w:t xml:space="preserve"> Khelawan Chaube</w:t>
+      </w:r>
+    </w:p>
+    <w:p>
+      <w:pPr>
+        <w:ind w:left="720"/>
+        <w:rPr>
+          <w:sz w:val="28"/>
+          <w:szCs w:val="28"/>
+        </w:rPr>
+      </w:pPr>
+      <w:r>
+        <w:rPr>
+          <w:b/>
+          <w:bCs/>
+          <w:sz w:val="28"/>
+          <w:szCs w:val="28"/>
+        </w:rPr>
+        <w:t>S:</w:t>
+      </w:r>
+      <w:r>
+        <w:rPr>
+          <w:sz w:val="28"/>
+          <w:szCs w:val="28"/>
+        </w:rPr>
+        <w:t xml:space="preserve"> Fatigan Miyan</w:t>
+      </w:r>
+    </w:p>
+    <w:p>
+      <w:pPr>
+        <w:ind w:left="720"/>
+        <w:rPr>
+          <w:sz w:val="28"/>
+          <w:szCs w:val="28"/>
+        </w:rPr>
+      </w:pPr>
+      <w:r>
+        <w:rPr>
+          <w:b/>
+          <w:bCs/>
+          <w:sz w:val="28"/>
+          <w:szCs w:val="28"/>
+        </w:rPr>
+        <w:t>E:</w:t>
+      </w:r>
+      <w:r>
+        <w:rPr>
+          <w:sz w:val="28"/>
+          <w:szCs w:val="28"/>
+        </w:rPr>
+        <w:t xml:space="preserve"> Ragho</w:t>
+      </w:r>
+      <w:r>
+        <w:rPr>
+          <w:sz w:val="28"/>
+          <w:szCs w:val="28"/>
+        </w:rPr>
+        <w:t xml:space="preserve"> </w:t>
+      </w:r>
+      <w:r>
+        <w:rPr>
+          <w:sz w:val="28"/>
+          <w:szCs w:val="28"/>
+        </w:rPr>
+        <w:t>Ji Chaube</w:t>
+      </w:r>
+    </w:p>
+    <w:p>
+      <w:pPr>
+        <w:ind w:left="720"/>
+        <w:rPr>
+          <w:sz w:val="28"/>
+          <w:szCs w:val="28"/>
+        </w:rPr>
+      </w:pPr>
+      <w:r>
+        <w:rPr>
+          <w:b/>
+          <w:bCs/>
+          <w:sz w:val="28"/>
+          <w:szCs w:val="28"/>
+        </w:rPr>
+        <w:t>W:</w:t>
+      </w:r>
+      <w:r>
+        <w:rPr>
+          <w:sz w:val="28"/>
+          <w:szCs w:val="28"/>
+        </w:rPr>
+        <w:t xml:space="preserve"> Nij</w:t>
+      </w:r>
+      <w:r>
+        <w:rPr>
+          <w:sz w:val="28"/>
+          <w:szCs w:val="28"/>
+        </w:rPr>
+        <w:t xml:space="preserve"> (apna)</w:t>
+      </w:r>
+    </w:p>
+    <w:p>
+      <w:pPr>
+        <w:rPr>
+          <w:sz w:val="28"/>
+          <w:szCs w:val="28"/>
+        </w:rPr>
+      </w:pPr>
+    </w:p>
+    <w:p>
+      <w:pPr>
+        <w:rPr>
+          <w:sz w:val="28"/>
+          <w:szCs w:val="28"/>
+        </w:rPr>
+      </w:pPr>
+      <w:r>
+        <w:rPr>
+          <w:b/>
+          <w:bCs/>
+          <w:sz w:val="28"/>
+          <w:szCs w:val="28"/>
+        </w:rPr>
+        <w:t>711:</w:t>
+      </w:r>
+      <w:r>
+        <w:rPr>
+          <w:sz w:val="28"/>
+          <w:szCs w:val="28"/>
+        </w:rPr>
+        <w:t xml:space="preserve"> 2 katha, 14 dhur = 10 dismil</w:t>
+      </w:r>
+    </w:p>
+    <w:p>
+      <w:pPr>
+        <w:ind w:left="720"/>
+        <w:rPr>
+          <w:sz w:val="28"/>
+          <w:szCs w:val="28"/>
+        </w:rPr>
+      </w:pPr>
+      <w:r>
+        <w:rPr>
+          <w:b/>
+          <w:bCs/>
+          <w:sz w:val="28"/>
+          <w:szCs w:val="28"/>
+        </w:rPr>
+        <w:t>N:</w:t>
+      </w:r>
+      <w:r>
+        <w:rPr>
+          <w:sz w:val="28"/>
+          <w:szCs w:val="28"/>
+        </w:rPr>
+        <w:t xml:space="preserve"> Kisun Dev Bari</w:t>
+      </w:r>
+    </w:p>
+    <w:p>
+      <w:pPr>
+        <w:ind w:left="720"/>
+        <w:rPr>
+          <w:sz w:val="28"/>
+          <w:szCs w:val="28"/>
+        </w:rPr>
+      </w:pPr>
+      <w:r>
+        <w:rPr>
+          <w:b/>
+          <w:bCs/>
+          <w:sz w:val="28"/>
+          <w:szCs w:val="28"/>
+        </w:rPr>
+        <w:t>S:</w:t>
+      </w:r>
+      <w:r>
+        <w:rPr>
+          <w:sz w:val="28"/>
+          <w:szCs w:val="28"/>
+        </w:rPr>
+        <w:t xml:space="preserve"> Fatigan Miyan</w:t>
+      </w:r>
+    </w:p>
+    <w:p>
+      <w:pPr>
+        <w:ind w:left="720"/>
+        <w:rPr>
+          <w:sz w:val="28"/>
+          <w:szCs w:val="28"/>
+        </w:rPr>
+      </w:pPr>
+      <w:r>
+        <w:rPr>
+          <w:b/>
+          <w:bCs/>
+          <w:sz w:val="28"/>
+          <w:szCs w:val="28"/>
+        </w:rPr>
+        <w:t>E:</w:t>
+      </w:r>
+      <w:r>
+        <w:rPr>
+          <w:sz w:val="28"/>
+          <w:szCs w:val="28"/>
+        </w:rPr>
+        <w:t xml:space="preserve"> Varhamdev Rai</w:t>
+      </w:r>
+    </w:p>
+    <w:p>
+      <w:pPr>
+        <w:ind w:left="720"/>
+        <w:rPr>
+          <w:sz w:val="28"/>
+          <w:szCs w:val="28"/>
+        </w:rPr>
+      </w:pPr>
+      <w:r>
+        <w:rPr>
+          <w:b/>
+          <w:bCs/>
+          <w:sz w:val="28"/>
+          <w:szCs w:val="28"/>
+        </w:rPr>
+        <w:t>W:</w:t>
+      </w:r>
+      <w:r>
+        <w:rPr>
+          <w:sz w:val="28"/>
+          <w:szCs w:val="28"/>
+        </w:rPr>
+        <w:t xml:space="preserve"> Makhu Miyan</w:t>
+      </w:r>
+    </w:p>
+    <w:p>
+      <w:pPr>
+        <w:rPr>
+          <w:sz w:val="28"/>
+          <w:szCs w:val="28"/>
+        </w:rPr>
+      </w:pPr>
+      <w:r>
+        <w:rPr>
+          <w:sz w:val="28"/>
+          <w:szCs w:val="28"/>
+        </w:rPr>
+        <w:br w:type="page"/>
+      </w:r>
+    </w:p>
+    <w:p>
+      <w:pPr>
+        <w:rPr>
+          <w:sz w:val="28"/>
+          <w:szCs w:val="28"/>
+        </w:rPr>
+      </w:pPr>
+      <w:r>
+        <w:rPr>
           <w:rFonts w:ascii="Arial Black" w:hAnsi="Arial Black" w:cs="Nirmala UI"/>
           <w:sz w:val="28"/>
           <w:szCs w:val="28"/>
         </w:rPr>
+        <w:lastRenderedPageBreak/>
         <w:t>Khata</w:t>
       </w:r>
       <w:r>
@@ -1464,14 +1966,14 @@
           <w:sz w:val="28"/>
           <w:szCs w:val="28"/>
         </w:rPr>
-        <w:t>585:</w:t>
-      </w:r>
-      <w:r>
-        <w:rPr>
-          <w:sz w:val="28"/>
-          <w:szCs w:val="28"/>
-        </w:rPr>
-        <w:t xml:space="preserve"> 2 katha, 19 dhur = 11 dismil</w:t>
+        <w:t>726:</w:t>
+      </w:r>
+      <w:r>
+        <w:rPr>
+          <w:sz w:val="28"/>
+          <w:szCs w:val="28"/>
+        </w:rPr>
+        <w:t xml:space="preserve"> 2 katha, 03 dhur = 8 dismil</w:t>
       </w:r>
     </w:p>
     <w:p>
@@ -1496,21 +1998,7 @@
           <w:sz w:val="28"/>
           <w:szCs w:val="28"/>
         </w:rPr>
-        <w:t xml:space="preserve"> Vaka</w:t>
-      </w:r>
-      <w:r>
-        <w:rPr>
-          <w:sz w:val="28"/>
-          <w:szCs w:val="28"/>
-        </w:rPr>
-        <w:t>a</w:t>
-      </w:r>
-      <w:r>
-        <w:rPr>
-          <w:sz w:val="28"/>
-          <w:szCs w:val="28"/>
-        </w:rPr>
-        <w:t>sh Malikan</w:t>
+        <w:t xml:space="preserve"> Baldev Barai</w:t>
       </w:r>
     </w:p>
     <w:p>
@@ -1535,6 +2023,138 @@
           <w:sz w:val="28"/>
           <w:szCs w:val="28"/>
         </w:rPr>
+        <w:t xml:space="preserve"> Moshafir Miyan</w:t>
+      </w:r>
+    </w:p>
+    <w:p>
+      <w:pPr>
+        <w:ind w:left="720"/>
+        <w:rPr>
+          <w:sz w:val="28"/>
+          <w:szCs w:val="28"/>
+        </w:rPr>
+      </w:pPr>
+      <w:r>
+        <w:rPr>
+          <w:b/>
+          <w:bCs/>
+          <w:sz w:val="28"/>
+          <w:szCs w:val="28"/>
+        </w:rPr>
+        <w:t>E:</w:t>
+      </w:r>
+      <w:r>
+        <w:rPr>
+          <w:sz w:val="28"/>
+          <w:szCs w:val="28"/>
+        </w:rPr>
+        <w:t xml:space="preserve"> Verhamdev Rai</w:t>
+      </w:r>
+    </w:p>
+    <w:p>
+      <w:pPr>
+        <w:ind w:left="720"/>
+        <w:rPr>
+          <w:sz w:val="28"/>
+          <w:szCs w:val="28"/>
+        </w:rPr>
+      </w:pPr>
+      <w:r>
+        <w:rPr>
+          <w:b/>
+          <w:bCs/>
+          <w:sz w:val="28"/>
+          <w:szCs w:val="28"/>
+        </w:rPr>
+        <w:t>W:</w:t>
+      </w:r>
+      <w:r>
+        <w:rPr>
+          <w:sz w:val="28"/>
+          <w:szCs w:val="28"/>
+        </w:rPr>
+        <w:t xml:space="preserve"> Riyasat Miyan</w:t>
+      </w:r>
+    </w:p>
+    <w:p>
+      <w:pPr>
+        <w:rPr>
+          <w:sz w:val="28"/>
+          <w:szCs w:val="28"/>
+        </w:rPr>
+      </w:pPr>
+    </w:p>
+    <w:p>
+      <w:pPr>
+        <w:rPr>
+          <w:sz w:val="28"/>
+          <w:szCs w:val="28"/>
+        </w:rPr>
+      </w:pPr>
+      <w:r>
+        <w:rPr>
+          <w:b/>
+          <w:bCs/>
+          <w:sz w:val="28"/>
+          <w:szCs w:val="28"/>
+        </w:rPr>
+        <w:t>737:</w:t>
+      </w:r>
+      <w:r>
+        <w:rPr>
+          <w:sz w:val="28"/>
+          <w:szCs w:val="28"/>
+        </w:rPr>
+        <w:t xml:space="preserve"> 4 katha, 01 dhur = 15 dismil</w:t>
+      </w:r>
+    </w:p>
+    <w:p>
+      <w:pPr>
+        <w:ind w:left="720"/>
+        <w:rPr>
+          <w:sz w:val="28"/>
+          <w:szCs w:val="28"/>
+        </w:rPr>
+      </w:pPr>
+      <w:r>
+        <w:rPr>
+          <w:b/>
+          <w:bCs/>
+          <w:sz w:val="28"/>
+          <w:szCs w:val="28"/>
+        </w:rPr>
+        <w:t>N:</w:t>
+      </w:r>
+      <w:r>
+        <w:rPr>
+          <w:sz w:val="28"/>
+          <w:szCs w:val="28"/>
+        </w:rPr>
+        <w:t xml:space="preserve"> Jagdev Tiwari</w:t>
+      </w:r>
+    </w:p>
+    <w:p>
+      <w:pPr>
+        <w:ind w:left="720"/>
+        <w:rPr>
+          <w:sz w:val="28"/>
+          <w:szCs w:val="28"/>
+        </w:rPr>
+      </w:pPr>
+      <w:r>
+        <w:rPr>
+          <w:b/>
+          <w:bCs/>
+          <w:sz w:val="28"/>
+          <w:szCs w:val="28"/>
+        </w:rPr>
+        <w:t>S:</w:t>
+      </w:r>
+      <w:r>
+        <w:rPr>
+          <w:sz w:val="28"/>
+          <w:szCs w:val="28"/>
+        </w:rPr>
         <w:t xml:space="preserve"> Fatigan Miyan</w:t>
       </w:r>
     </w:p>
@@ -1560,6 +2180,388 @@
           <w:sz w:val="28"/>
           <w:szCs w:val="28"/>
         </w:rPr>
+        <w:t xml:space="preserve"> Jagdev Tiwari</w:t>
+      </w:r>
+    </w:p>
+    <w:p>
+      <w:pPr>
+        <w:ind w:left="720"/>
+        <w:rPr>
+          <w:sz w:val="28"/>
+          <w:szCs w:val="28"/>
+        </w:rPr>
+      </w:pPr>
+      <w:r>
+        <w:rPr>
+          <w:b/>
+          <w:bCs/>
+          <w:sz w:val="28"/>
+          <w:szCs w:val="28"/>
+        </w:rPr>
+        <w:t>W:</w:t>
+      </w:r>
+      <w:r>
+        <w:rPr>
+          <w:sz w:val="28"/>
+          <w:szCs w:val="28"/>
+        </w:rPr>
+        <w:t xml:space="preserve"> Ramjit Singh</w:t>
+      </w:r>
+    </w:p>
+    <w:p>
+      <w:pPr>
+        <w:rPr>
+          <w:rFonts w:ascii="Arial Black" w:hAnsi="Arial Black" w:cs="Nirmala UI"/>
+          <w:sz w:val="28"/>
+          <w:szCs w:val="28"/>
+        </w:rPr>
+      </w:pPr>
+    </w:p>
+    <w:p>
+      <w:pPr>
+        <w:rPr>
+          <w:sz w:val="28"/>
+          <w:szCs w:val="28"/>
+        </w:rPr>
+      </w:pPr>
+      <w:r>
+        <w:rPr>
+          <w:b/>
+          <w:bCs/>
+          <w:sz w:val="28"/>
+          <w:szCs w:val="28"/>
+        </w:rPr>
+        <w:t>767:</w:t>
+      </w:r>
+      <w:r>
+        <w:rPr>
+          <w:sz w:val="28"/>
+          <w:szCs w:val="28"/>
+        </w:rPr>
+        <w:t xml:space="preserve"> 6 katha, 09 dhur = 24 dismil</w:t>
+      </w:r>
+    </w:p>
+    <w:p>
+      <w:pPr>
+        <w:ind w:left="720"/>
+        <w:rPr>
+          <w:sz w:val="28"/>
+          <w:szCs w:val="28"/>
+        </w:rPr>
+      </w:pPr>
+      <w:r>
+        <w:rPr>
+          <w:b/>
+          <w:bCs/>
+          <w:sz w:val="28"/>
+          <w:szCs w:val="28"/>
+        </w:rPr>
+        <w:t>N:</w:t>
+      </w:r>
+      <w:r>
+        <w:rPr>
+          <w:sz w:val="28"/>
+          <w:szCs w:val="28"/>
+        </w:rPr>
+        <w:t xml:space="preserve"> Chand Govind Pathak</w:t>
+      </w:r>
+    </w:p>
+    <w:p>
+      <w:pPr>
+        <w:ind w:left="720"/>
+        <w:rPr>
+          <w:sz w:val="28"/>
+          <w:szCs w:val="28"/>
+        </w:rPr>
+      </w:pPr>
+      <w:r>
+        <w:rPr>
+          <w:b/>
+          <w:bCs/>
+          <w:sz w:val="28"/>
+          <w:szCs w:val="28"/>
+        </w:rPr>
+        <w:t>S:</w:t>
+      </w:r>
+      <w:r>
+        <w:rPr>
+          <w:sz w:val="28"/>
+          <w:szCs w:val="28"/>
+        </w:rPr>
+        <w:t xml:space="preserve"> Baldev Barai</w:t>
+      </w:r>
+    </w:p>
+    <w:p>
+      <w:pPr>
+        <w:ind w:left="720"/>
+        <w:rPr>
+          <w:sz w:val="28"/>
+          <w:szCs w:val="28"/>
+        </w:rPr>
+      </w:pPr>
+      <w:r>
+        <w:rPr>
+          <w:b/>
+          <w:bCs/>
+          <w:sz w:val="28"/>
+          <w:szCs w:val="28"/>
+        </w:rPr>
+        <w:t>E:</w:t>
+      </w:r>
+      <w:r>
+        <w:rPr>
+          <w:sz w:val="28"/>
+          <w:szCs w:val="28"/>
+        </w:rPr>
+        <w:t xml:space="preserve"> Fatigan Miyan</w:t>
+      </w:r>
+    </w:p>
+    <w:p>
+      <w:pPr>
+        <w:ind w:left="720"/>
+        <w:rPr>
+          <w:sz w:val="28"/>
+          <w:szCs w:val="28"/>
+        </w:rPr>
+      </w:pPr>
+      <w:r>
+        <w:rPr>
+          <w:b/>
+          <w:bCs/>
+          <w:sz w:val="28"/>
+          <w:szCs w:val="28"/>
+        </w:rPr>
+        <w:t>W:</w:t>
+      </w:r>
+      <w:r>
+        <w:rPr>
+          <w:sz w:val="28"/>
+          <w:szCs w:val="28"/>
+        </w:rPr>
+        <w:t xml:space="preserve"> Tulsi Barai</w:t>
+      </w:r>
+    </w:p>
+    <w:p>
+      <w:pPr>
+        <w:ind w:left="720"/>
+        <w:rPr>
+          <w:sz w:val="28"/>
+          <w:szCs w:val="28"/>
+        </w:rPr>
+      </w:pPr>
+    </w:p>
+    <w:p>
+      <w:pPr>
+        <w:rPr>
+          <w:sz w:val="28"/>
+          <w:szCs w:val="28"/>
+        </w:rPr>
+      </w:pPr>
+      <w:r>
+        <w:rPr>
+          <w:b/>
+          <w:bCs/>
+          <w:sz w:val="28"/>
+          <w:szCs w:val="28"/>
+        </w:rPr>
+        <w:t>770:</w:t>
+      </w:r>
+      <w:r>
+        <w:rPr>
+          <w:sz w:val="28"/>
+          <w:szCs w:val="28"/>
+        </w:rPr>
+        <w:t xml:space="preserve"> 1 katha, 07 dhur = 5 dismil</w:t>
+      </w:r>
+    </w:p>
+    <w:p>
+      <w:pPr>
+        <w:ind w:left="720"/>
+        <w:rPr>
+          <w:sz w:val="28"/>
+          <w:szCs w:val="28"/>
+        </w:rPr>
+      </w:pPr>
+      <w:r>
+        <w:rPr>
+          <w:b/>
+          <w:bCs/>
+          <w:sz w:val="28"/>
+          <w:szCs w:val="28"/>
+        </w:rPr>
+        <w:t>N:</w:t>
+      </w:r>
+      <w:r>
+        <w:rPr>
+          <w:sz w:val="28"/>
+          <w:szCs w:val="28"/>
+        </w:rPr>
+        <w:t xml:space="preserve"> Fatigan Miyan</w:t>
+      </w:r>
+    </w:p>
+    <w:p>
+      <w:pPr>
+        <w:ind w:left="720"/>
+        <w:rPr>
+          <w:sz w:val="28"/>
+          <w:szCs w:val="28"/>
+        </w:rPr>
+      </w:pPr>
+      <w:r>
+        <w:rPr>
+          <w:b/>
+          <w:bCs/>
+          <w:sz w:val="28"/>
+          <w:szCs w:val="28"/>
+        </w:rPr>
+        <w:t>S:</w:t>
+      </w:r>
+      <w:r>
+        <w:rPr>
+          <w:sz w:val="28"/>
+          <w:szCs w:val="28"/>
+        </w:rPr>
+        <w:t xml:space="preserve"> Fatigan Miyan</w:t>
+      </w:r>
+    </w:p>
+    <w:p>
+      <w:pPr>
+        <w:ind w:left="720"/>
+        <w:rPr>
+          <w:sz w:val="28"/>
+          <w:szCs w:val="28"/>
+        </w:rPr>
+      </w:pPr>
+      <w:r>
+        <w:rPr>
+          <w:b/>
+          <w:bCs/>
+          <w:sz w:val="28"/>
+          <w:szCs w:val="28"/>
+        </w:rPr>
+        <w:t>E:</w:t>
+      </w:r>
+      <w:r>
+        <w:rPr>
+          <w:sz w:val="28"/>
+          <w:szCs w:val="28"/>
+        </w:rPr>
+        <w:t xml:space="preserve"> Suba Miyan</w:t>
+      </w:r>
+    </w:p>
+    <w:p>
+      <w:pPr>
+        <w:ind w:left="720"/>
+        <w:rPr>
+          <w:sz w:val="28"/>
+          <w:szCs w:val="28"/>
+        </w:rPr>
+      </w:pPr>
+      <w:r>
+        <w:rPr>
+          <w:b/>
+          <w:bCs/>
+          <w:sz w:val="28"/>
+          <w:szCs w:val="28"/>
+        </w:rPr>
+        <w:t>W:</w:t>
+      </w:r>
+      <w:r>
+        <w:rPr>
+          <w:sz w:val="28"/>
+          <w:szCs w:val="28"/>
+        </w:rPr>
+        <w:t xml:space="preserve"> Baldev Barai</w:t>
+      </w:r>
+    </w:p>
+    <w:p>
+      <w:pPr>
+        <w:rPr>
+          <w:sz w:val="28"/>
+          <w:szCs w:val="28"/>
+        </w:rPr>
+      </w:pPr>
+      <w:r>
+        <w:rPr>
+          <w:sz w:val="28"/>
+          <w:szCs w:val="28"/>
+        </w:rPr>
+        <w:br w:type="page"/>
+      </w:r>
+    </w:p>
+    <w:p>
+      <w:pPr>
+        <w:rPr>
+          <w:sz w:val="28"/>
+          <w:szCs w:val="28"/>
+        </w:rPr>
+      </w:pPr>
+      <w:r>
+        <w:rPr>
+          <w:rFonts w:ascii="Arial Black" w:hAnsi="Arial Black" w:cs="Nirmala UI"/>
+          <w:sz w:val="28"/>
+          <w:szCs w:val="28"/>
+        </w:rPr>
+        <w:lastRenderedPageBreak/>
+        <w:t>Khata</w:t>
+      </w:r>
+      <w:r>
+        <w:rPr>
+          <w:rFonts w:ascii="Arial Black" w:hAnsi="Arial Black"/>
+          <w:b/>
+          <w:bCs/>
+          <w:sz w:val="28"/>
+          <w:szCs w:val="28"/>
+        </w:rPr>
+        <w:t>-145:</w:t>
+      </w:r>
+    </w:p>
+    <w:p>
+      <w:pPr>
+        <w:rPr>
+          <w:sz w:val="28"/>
+          <w:szCs w:val="28"/>
+        </w:rPr>
+      </w:pPr>
+      <w:r>
+        <w:rPr>
+          <w:b/>
+          <w:bCs/>
+          <w:sz w:val="28"/>
+          <w:szCs w:val="28"/>
+        </w:rPr>
+        <w:t>2058:</w:t>
+      </w:r>
+      <w:r>
+        <w:rPr>
+          <w:sz w:val="28"/>
+          <w:szCs w:val="28"/>
+        </w:rPr>
+        <w:t xml:space="preserve"> 1 katha, 18 dhur = 7 dismil</w:t>
+      </w:r>
+    </w:p>
+    <w:p>
+      <w:pPr>
+        <w:ind w:left="720"/>
+        <w:rPr>
+          <w:sz w:val="28"/>
+          <w:szCs w:val="28"/>
+        </w:rPr>
+      </w:pPr>
+      <w:r>
+        <w:rPr>
+          <w:b/>
+          <w:bCs/>
+          <w:sz w:val="28"/>
+          <w:szCs w:val="28"/>
+        </w:rPr>
+        <w:t>N:</w:t>
+      </w:r>
+      <w:r>
+        <w:rPr>
+          <w:sz w:val="28"/>
+          <w:szCs w:val="28"/>
+        </w:rPr>
         <w:t xml:space="preserve"> Dukhi Miyan</w:t>
       </w:r>
     </w:p>
@@ -1578,6 +2580,56 @@
           <w:sz w:val="28"/>
           <w:szCs w:val="28"/>
         </w:rPr>
+        <w:t>S:</w:t>
+      </w:r>
+      <w:r>
+        <w:rPr>
+          <w:sz w:val="28"/>
+          <w:szCs w:val="28"/>
+        </w:rPr>
+        <w:t xml:space="preserve"> Suba Miyan</w:t>
+      </w:r>
+    </w:p>
+    <w:p>
+      <w:pPr>
+        <w:ind w:left="720"/>
+        <w:rPr>
+          <w:sz w:val="28"/>
+          <w:szCs w:val="28"/>
+        </w:rPr>
+      </w:pPr>
+      <w:r>
+        <w:rPr>
+          <w:b/>
+          <w:bCs/>
+          <w:sz w:val="28"/>
+          <w:szCs w:val="28"/>
+        </w:rPr>
+        <w:t>E:</w:t>
+      </w:r>
+      <w:r>
+        <w:rPr>
+          <w:sz w:val="28"/>
+          <w:szCs w:val="28"/>
+        </w:rPr>
+        <w:t xml:space="preserve"> Fatigan Miyan</w:t>
+      </w:r>
+    </w:p>
+    <w:p>
+      <w:pPr>
+        <w:ind w:left="720"/>
+        <w:rPr>
+          <w:sz w:val="28"/>
+          <w:szCs w:val="28"/>
+        </w:rPr>
+      </w:pPr>
+      <w:r>
+        <w:rPr>
+          <w:b/>
+          <w:bCs/>
+          <w:sz w:val="28"/>
+          <w:szCs w:val="28"/>
+        </w:rPr>
         <w:t>W:</w:t>
       </w:r>
       <w:r>
@@ -1585,6 +2637,88 @@
           <w:sz w:val="28"/>
           <w:szCs w:val="28"/>
         </w:rPr>
+        <w:t xml:space="preserve"> Fatigan Miyan</w:t>
+      </w:r>
+    </w:p>
+    <w:p>
+      <w:pPr>
+        <w:rPr>
+          <w:sz w:val="28"/>
+          <w:szCs w:val="28"/>
+        </w:rPr>
+      </w:pPr>
+    </w:p>
+    <w:p>
+      <w:pPr>
+        <w:rPr>
+          <w:sz w:val="28"/>
+          <w:szCs w:val="28"/>
+        </w:rPr>
+      </w:pPr>
+      <w:r>
+        <w:rPr>
+          <w:b/>
+          <w:bCs/>
+          <w:sz w:val="28"/>
+          <w:szCs w:val="28"/>
+        </w:rPr>
+        <w:t>2063:</w:t>
+      </w:r>
+      <w:r>
+        <w:rPr>
+          <w:sz w:val="28"/>
+          <w:szCs w:val="28"/>
+        </w:rPr>
+        <w:t xml:space="preserve"> 16 dhur = 3 dismil</w:t>
+      </w:r>
+    </w:p>
+    <w:p>
+      <w:pPr>
+        <w:ind w:left="720"/>
+        <w:rPr>
+          <w:sz w:val="28"/>
+          <w:szCs w:val="28"/>
+        </w:rPr>
+      </w:pPr>
+      <w:r>
+        <w:rPr>
+          <w:b/>
+          <w:bCs/>
+          <w:sz w:val="28"/>
+          <w:szCs w:val="28"/>
+        </w:rPr>
+        <w:t>N:</w:t>
+      </w:r>
+      <w:r>
+        <w:rPr>
+          <w:sz w:val="28"/>
+          <w:szCs w:val="28"/>
+        </w:rPr>
+        <w:t xml:space="preserve"> Dukhi Miyan</w:t>
+      </w:r>
+    </w:p>
+    <w:p>
+      <w:pPr>
+        <w:ind w:left="720"/>
+        <w:rPr>
+          <w:sz w:val="28"/>
+          <w:szCs w:val="28"/>
+        </w:rPr>
+      </w:pPr>
+      <w:r>
+        <w:rPr>
+          <w:b/>
+          <w:bCs/>
+          <w:sz w:val="28"/>
+          <w:szCs w:val="28"/>
+        </w:rPr>
+        <w:t>S:</w:t>
+      </w:r>
+      <w:r>
+        <w:rPr>
+          <w:sz w:val="28"/>
+          <w:szCs w:val="28"/>
+        </w:rPr>
         <w:t xml:space="preserve"> Jagdev Tiwari</w:t>
       </w:r>
     </w:p>
@@ -1592,6 +2726,63 @@
       <w:pPr>
         <w:ind w:left="720"/>
         <w:rPr>
+          <w:sz w:val="28"/>
+          <w:szCs w:val="28"/>
+        </w:rPr>
+      </w:pPr>
+      <w:r>
+        <w:rPr>
+          <w:b/>
+          <w:bCs/>
+          <w:sz w:val="28"/>
+          <w:szCs w:val="28"/>
+        </w:rPr>
+        <w:t>E:</w:t>
+      </w:r>
+      <w:r>
+        <w:rPr>
+          <w:sz w:val="28"/>
+          <w:szCs w:val="28"/>
+        </w:rPr>
+        <w:t xml:space="preserve"> Suba Miyan</w:t>
+      </w:r>
+    </w:p>
+    <w:p>
+      <w:pPr>
+        <w:ind w:left="720"/>
+        <w:rPr>
+          <w:sz w:val="28"/>
+          <w:szCs w:val="28"/>
+        </w:rPr>
+      </w:pPr>
+      <w:r>
+        <w:rPr>
+          <w:b/>
+          <w:bCs/>
+          <w:sz w:val="28"/>
+          <w:szCs w:val="28"/>
+        </w:rPr>
+        <w:t>W:</w:t>
+      </w:r>
+      <w:r>
+        <w:rPr>
+          <w:sz w:val="28"/>
+          <w:szCs w:val="28"/>
+        </w:rPr>
+        <w:t xml:space="preserve"> Raghpal Rai</w:t>
+      </w:r>
+    </w:p>
+    <w:p>
+      <w:pPr>
+        <w:rPr>
+          <w:sz w:val="28"/>
+          <w:szCs w:val="28"/>
+        </w:rPr>
+      </w:pPr>
+    </w:p>
+    <w:p>
+      <w:pPr>
+        <w:rPr>
           <w:rFonts w:ascii="Arial Black" w:hAnsi="Arial Black"/>
           <w:b/>
           <w:bCs/>
@@ -1599,576 +2790,15 @@
           <w:szCs w:val="28"/>
         </w:rPr>
       </w:pPr>
-    </w:p>
-    <w:p>
-      <w:pPr>
-        <w:rPr>
-          <w:sz w:val="28"/>
-          <w:szCs w:val="28"/>
-        </w:rPr>
-      </w:pPr>
-      <w:r>
-        <w:rPr>
-          <w:b/>
-          <w:bCs/>
-          <w:sz w:val="28"/>
-          <w:szCs w:val="28"/>
-        </w:rPr>
-        <w:t>633:</w:t>
-      </w:r>
-      <w:r>
-        <w:rPr>
-          <w:sz w:val="28"/>
-          <w:szCs w:val="28"/>
-        </w:rPr>
-        <w:t xml:space="preserve"> 3 katha, 15 dhur = 14 dismil</w:t>
-      </w:r>
-    </w:p>
-    <w:p>
-      <w:pPr>
-        <w:ind w:left="720"/>
-        <w:rPr>
-          <w:sz w:val="28"/>
-          <w:szCs w:val="28"/>
-        </w:rPr>
-      </w:pPr>
-      <w:r>
-        <w:rPr>
-          <w:b/>
-          <w:bCs/>
-          <w:sz w:val="28"/>
-          <w:szCs w:val="28"/>
-        </w:rPr>
-        <w:t>N:</w:t>
-      </w:r>
-      <w:r>
-        <w:rPr>
-          <w:sz w:val="28"/>
-          <w:szCs w:val="28"/>
-        </w:rPr>
-        <w:t xml:space="preserve"> Khelawan Chaube</w:t>
-      </w:r>
-    </w:p>
-    <w:p>
-      <w:pPr>
-        <w:ind w:left="720"/>
-        <w:rPr>
-          <w:sz w:val="28"/>
-          <w:szCs w:val="28"/>
-        </w:rPr>
-      </w:pPr>
-      <w:r>
-        <w:rPr>
-          <w:b/>
-          <w:bCs/>
-          <w:sz w:val="28"/>
-          <w:szCs w:val="28"/>
-        </w:rPr>
-        <w:t>S:</w:t>
-      </w:r>
-      <w:r>
-        <w:rPr>
-          <w:sz w:val="28"/>
-          <w:szCs w:val="28"/>
-        </w:rPr>
-        <w:t xml:space="preserve"> Fatigan Miyan</w:t>
-      </w:r>
-    </w:p>
-    <w:p>
-      <w:pPr>
-        <w:ind w:left="720"/>
-        <w:rPr>
-          <w:sz w:val="28"/>
-          <w:szCs w:val="28"/>
-        </w:rPr>
-      </w:pPr>
-      <w:r>
-        <w:rPr>
-          <w:b/>
-          <w:bCs/>
-          <w:sz w:val="28"/>
-          <w:szCs w:val="28"/>
-        </w:rPr>
-        <w:t>E:</w:t>
-      </w:r>
-      <w:r>
-        <w:rPr>
-          <w:sz w:val="28"/>
-          <w:szCs w:val="28"/>
-        </w:rPr>
-        <w:t xml:space="preserve"> Ragho</w:t>
-      </w:r>
-      <w:r>
-        <w:rPr>
-          <w:sz w:val="28"/>
-          <w:szCs w:val="28"/>
-        </w:rPr>
-        <w:t xml:space="preserve"> </w:t>
-      </w:r>
-      <w:r>
-        <w:rPr>
-          <w:sz w:val="28"/>
-          <w:szCs w:val="28"/>
-        </w:rPr>
-        <w:t>Ji Chaube</w:t>
-      </w:r>
-    </w:p>
-    <w:p>
-      <w:pPr>
-        <w:ind w:left="720"/>
-        <w:rPr>
-          <w:sz w:val="28"/>
-          <w:szCs w:val="28"/>
-        </w:rPr>
-      </w:pPr>
-      <w:r>
-        <w:rPr>
-          <w:b/>
-          <w:bCs/>
-          <w:sz w:val="28"/>
-          <w:szCs w:val="28"/>
-        </w:rPr>
-        <w:t>W:</w:t>
-      </w:r>
-      <w:r>
-        <w:rPr>
-          <w:sz w:val="28"/>
-          <w:szCs w:val="28"/>
-        </w:rPr>
-        <w:t xml:space="preserve"> Nij</w:t>
-      </w:r>
-      <w:r>
-        <w:rPr>
-          <w:sz w:val="28"/>
-          <w:szCs w:val="28"/>
-        </w:rPr>
-        <w:t xml:space="preserve"> (apna)</w:t>
-      </w:r>
-    </w:p>
-    <w:p>
-      <w:pPr>
-        <w:rPr>
-          <w:sz w:val="28"/>
-          <w:szCs w:val="28"/>
-        </w:rPr>
-      </w:pPr>
-    </w:p>
-    <w:p>
-      <w:pPr>
-        <w:rPr>
-          <w:sz w:val="28"/>
-          <w:szCs w:val="28"/>
-        </w:rPr>
-      </w:pPr>
-      <w:r>
-        <w:rPr>
-          <w:b/>
-          <w:bCs/>
-          <w:sz w:val="28"/>
-          <w:szCs w:val="28"/>
-        </w:rPr>
-        <w:t>711:</w:t>
-      </w:r>
-      <w:r>
-        <w:rPr>
-          <w:sz w:val="28"/>
-          <w:szCs w:val="28"/>
-        </w:rPr>
-        <w:t xml:space="preserve"> 2 katha, 14 dhur = 10 dismil</w:t>
-      </w:r>
-    </w:p>
-    <w:p>
-      <w:pPr>
-        <w:ind w:left="720"/>
-        <w:rPr>
-          <w:sz w:val="28"/>
-          <w:szCs w:val="28"/>
-        </w:rPr>
-      </w:pPr>
-      <w:r>
-        <w:rPr>
-          <w:b/>
-          <w:bCs/>
-          <w:sz w:val="28"/>
-          <w:szCs w:val="28"/>
-        </w:rPr>
-        <w:t>N:</w:t>
-      </w:r>
-      <w:r>
-        <w:rPr>
-          <w:sz w:val="28"/>
-          <w:szCs w:val="28"/>
-        </w:rPr>
-        <w:t xml:space="preserve"> Kisun Dev Bari</w:t>
-      </w:r>
-    </w:p>
-    <w:p>
-      <w:pPr>
-        <w:ind w:left="720"/>
-        <w:rPr>
-          <w:sz w:val="28"/>
-          <w:szCs w:val="28"/>
-        </w:rPr>
-      </w:pPr>
-      <w:r>
-        <w:rPr>
-          <w:b/>
-          <w:bCs/>
-          <w:sz w:val="28"/>
-          <w:szCs w:val="28"/>
-        </w:rPr>
-        <w:t>S:</w:t>
-      </w:r>
-      <w:r>
-        <w:rPr>
-          <w:sz w:val="28"/>
-          <w:szCs w:val="28"/>
-        </w:rPr>
-        <w:t xml:space="preserve"> Fatigan Miyan</w:t>
-      </w:r>
-    </w:p>
-    <w:p>
-      <w:pPr>
-        <w:ind w:left="720"/>
-        <w:rPr>
-          <w:sz w:val="28"/>
-          <w:szCs w:val="28"/>
-        </w:rPr>
-      </w:pPr>
-      <w:r>
-        <w:rPr>
-          <w:b/>
-          <w:bCs/>
-          <w:sz w:val="28"/>
-          <w:szCs w:val="28"/>
-        </w:rPr>
-        <w:t>E:</w:t>
-      </w:r>
-      <w:r>
-        <w:rPr>
-          <w:sz w:val="28"/>
-          <w:szCs w:val="28"/>
-        </w:rPr>
-        <w:t xml:space="preserve"> Varhamdev Rai</w:t>
-      </w:r>
-    </w:p>
-    <w:p>
-      <w:pPr>
-        <w:ind w:left="720"/>
-        <w:rPr>
-          <w:sz w:val="28"/>
-          <w:szCs w:val="28"/>
-        </w:rPr>
-      </w:pPr>
-      <w:r>
-        <w:rPr>
-          <w:b/>
-          <w:bCs/>
-          <w:sz w:val="28"/>
-          <w:szCs w:val="28"/>
-        </w:rPr>
-        <w:t>W:</w:t>
-      </w:r>
-      <w:r>
-        <w:rPr>
-          <w:sz w:val="28"/>
-          <w:szCs w:val="28"/>
-        </w:rPr>
-        <w:t xml:space="preserve"> Makhu Miyan</w:t>
-      </w:r>
-    </w:p>
-    <w:p>
-      <w:pPr>
-        <w:rPr>
-          <w:sz w:val="28"/>
-          <w:szCs w:val="28"/>
-        </w:rPr>
-      </w:pPr>
-      <w:r>
-        <w:rPr>
-          <w:sz w:val="28"/>
-          <w:szCs w:val="28"/>
-        </w:rPr>
-        <w:br w:type="page"/>
-      </w:r>
-    </w:p>
-    <w:p>
-      <w:pPr>
-        <w:rPr>
-          <w:sz w:val="28"/>
-          <w:szCs w:val="28"/>
-        </w:rPr>
-      </w:pPr>
-      <w:r>
-        <w:rPr>
-          <w:b/>
-          <w:bCs/>
-          <w:sz w:val="28"/>
-          <w:szCs w:val="28"/>
-        </w:rPr>
-        <w:lastRenderedPageBreak/>
-        <w:t>726:</w:t>
-      </w:r>
-      <w:r>
-        <w:rPr>
-          <w:sz w:val="28"/>
-          <w:szCs w:val="28"/>
-        </w:rPr>
-        <w:t xml:space="preserve"> 2 katha, 03 dhur = 8 dismil</w:t>
-      </w:r>
-    </w:p>
-    <w:p>
-      <w:pPr>
-        <w:ind w:left="720"/>
-        <w:rPr>
-          <w:sz w:val="28"/>
-          <w:szCs w:val="28"/>
-        </w:rPr>
-      </w:pPr>
-      <w:r>
-        <w:rPr>
-          <w:b/>
-          <w:bCs/>
-          <w:sz w:val="28"/>
-          <w:szCs w:val="28"/>
-        </w:rPr>
-        <w:t>N:</w:t>
-      </w:r>
-      <w:r>
-        <w:rPr>
-          <w:sz w:val="28"/>
-          <w:szCs w:val="28"/>
-        </w:rPr>
-        <w:t xml:space="preserve"> Baldev Barai</w:t>
-      </w:r>
-    </w:p>
-    <w:p>
-      <w:pPr>
-        <w:ind w:left="720"/>
-        <w:rPr>
-          <w:sz w:val="28"/>
-          <w:szCs w:val="28"/>
-        </w:rPr>
-      </w:pPr>
-      <w:r>
-        <w:rPr>
-          <w:b/>
-          <w:bCs/>
-          <w:sz w:val="28"/>
-          <w:szCs w:val="28"/>
-        </w:rPr>
-        <w:t>S:</w:t>
-      </w:r>
-      <w:r>
-        <w:rPr>
-          <w:sz w:val="28"/>
-          <w:szCs w:val="28"/>
-        </w:rPr>
-        <w:t xml:space="preserve"> Moshafir Miyan</w:t>
-      </w:r>
-    </w:p>
-    <w:p>
-      <w:pPr>
-        <w:ind w:left="720"/>
-        <w:rPr>
-          <w:sz w:val="28"/>
-          <w:szCs w:val="28"/>
-        </w:rPr>
-      </w:pPr>
-      <w:r>
-        <w:rPr>
-          <w:b/>
-          <w:bCs/>
-          <w:sz w:val="28"/>
-          <w:szCs w:val="28"/>
-        </w:rPr>
-        <w:t>E:</w:t>
-      </w:r>
-      <w:r>
-        <w:rPr>
-          <w:sz w:val="28"/>
-          <w:szCs w:val="28"/>
-        </w:rPr>
-        <w:t xml:space="preserve"> Verhamdev Rai</w:t>
-      </w:r>
-    </w:p>
-    <w:p>
-      <w:pPr>
-        <w:ind w:left="720"/>
-        <w:rPr>
-          <w:sz w:val="28"/>
-          <w:szCs w:val="28"/>
-        </w:rPr>
-      </w:pPr>
-      <w:r>
-        <w:rPr>
-          <w:b/>
-          <w:bCs/>
-          <w:sz w:val="28"/>
-          <w:szCs w:val="28"/>
-        </w:rPr>
-        <w:t>W:</w:t>
-      </w:r>
-      <w:r>
-        <w:rPr>
-          <w:sz w:val="28"/>
-          <w:szCs w:val="28"/>
-        </w:rPr>
-        <w:t xml:space="preserve"> Riyasat Miyan</w:t>
-      </w:r>
-    </w:p>
-    <w:p>
-      <w:pPr>
-        <w:rPr>
-          <w:sz w:val="28"/>
-          <w:szCs w:val="28"/>
-        </w:rPr>
-      </w:pPr>
-    </w:p>
-    <w:p>
-      <w:pPr>
-        <w:rPr>
-          <w:sz w:val="28"/>
-          <w:szCs w:val="28"/>
-        </w:rPr>
-      </w:pPr>
-      <w:r>
-        <w:rPr>
-          <w:b/>
-          <w:bCs/>
-          <w:sz w:val="28"/>
-          <w:szCs w:val="28"/>
-        </w:rPr>
-        <w:t>737:</w:t>
-      </w:r>
-      <w:r>
-        <w:rPr>
-          <w:sz w:val="28"/>
-          <w:szCs w:val="28"/>
-        </w:rPr>
-        <w:t xml:space="preserve"> 4 katha, 01 dhur = 15 dismil</w:t>
-      </w:r>
-    </w:p>
-    <w:p>
-      <w:pPr>
-        <w:ind w:left="720"/>
-        <w:rPr>
-          <w:sz w:val="28"/>
-          <w:szCs w:val="28"/>
-        </w:rPr>
-      </w:pPr>
-      <w:r>
-        <w:rPr>
-          <w:b/>
-          <w:bCs/>
-          <w:sz w:val="28"/>
-          <w:szCs w:val="28"/>
-        </w:rPr>
-        <w:t>N:</w:t>
-      </w:r>
-      <w:r>
-        <w:rPr>
-          <w:sz w:val="28"/>
-          <w:szCs w:val="28"/>
-        </w:rPr>
-        <w:t xml:space="preserve"> Jagdev Tiwari</w:t>
-      </w:r>
-    </w:p>
-    <w:p>
-      <w:pPr>
-        <w:ind w:left="720"/>
-        <w:rPr>
-          <w:sz w:val="28"/>
-          <w:szCs w:val="28"/>
-        </w:rPr>
-      </w:pPr>
-      <w:r>
-        <w:rPr>
-          <w:b/>
-          <w:bCs/>
-          <w:sz w:val="28"/>
-          <w:szCs w:val="28"/>
-        </w:rPr>
-        <w:t>S:</w:t>
-      </w:r>
-      <w:r>
-        <w:rPr>
-          <w:sz w:val="28"/>
-          <w:szCs w:val="28"/>
-        </w:rPr>
-        <w:t xml:space="preserve"> Fatigan Miyan</w:t>
-      </w:r>
-    </w:p>
-    <w:p>
-      <w:pPr>
-        <w:ind w:left="720"/>
-        <w:rPr>
-          <w:sz w:val="28"/>
-          <w:szCs w:val="28"/>
-        </w:rPr>
-      </w:pPr>
-      <w:r>
-        <w:rPr>
-          <w:b/>
-          <w:bCs/>
-          <w:sz w:val="28"/>
-          <w:szCs w:val="28"/>
-        </w:rPr>
-        <w:t>E:</w:t>
-      </w:r>
-      <w:r>
-        <w:rPr>
-          <w:sz w:val="28"/>
-          <w:szCs w:val="28"/>
-        </w:rPr>
-        <w:t xml:space="preserve"> Jagdev Tiwari</w:t>
-      </w:r>
-    </w:p>
-    <w:p>
-      <w:pPr>
-        <w:ind w:left="720"/>
-        <w:rPr>
-          <w:sz w:val="28"/>
-          <w:szCs w:val="28"/>
-        </w:rPr>
-      </w:pPr>
-      <w:r>
-        <w:rPr>
-          <w:b/>
-          <w:bCs/>
-          <w:sz w:val="28"/>
-          <w:szCs w:val="28"/>
-        </w:rPr>
-        <w:t>W:</w:t>
-      </w:r>
-      <w:r>
-        <w:rPr>
-          <w:sz w:val="28"/>
-          <w:szCs w:val="28"/>
-        </w:rPr>
-        <w:t xml:space="preserve"> Ramjit Singh</w:t>
-      </w:r>
-    </w:p>
-    <w:p>
-      <w:pPr>
-        <w:ind w:left="720"/>
-        <w:rPr>
-          <w:sz w:val="28"/>
-          <w:szCs w:val="28"/>
-        </w:rPr>
-      </w:pPr>
-    </w:p>
-    <w:p>
-      <w:pPr>
-        <w:ind w:left="720"/>
-        <w:rPr>
-          <w:sz w:val="28"/>
-          <w:szCs w:val="28"/>
-        </w:rPr>
-      </w:pPr>
-    </w:p>
-    <w:p>
-      <w:pPr>
+      <w:r>
+        <w:rPr>
+          <w:rFonts w:ascii="Arial Black" w:hAnsi="Arial Black" w:cs="Nirmala UI"/>
+          <w:sz w:val="28"/>
+          <w:szCs w:val="28"/>
+        </w:rPr>
+        <w:t>Khata</w:t>
+      </w:r>
+      <w:r>
         <w:rPr>
           <w:rFonts w:ascii="Arial Black" w:hAnsi="Arial Black"/>
           <w:b/>
@@ -2176,14 +2806,7 @@
           <w:sz w:val="28"/>
           <w:szCs w:val="28"/>
         </w:rPr>
-      </w:pPr>
-      <w:r>
-        <w:rPr>
-          <w:rFonts w:ascii="Arial Black" w:hAnsi="Arial Black" w:cs="Nirmala UI"/>
-          <w:sz w:val="28"/>
-          <w:szCs w:val="28"/>
-        </w:rPr>
-        <w:t>Khata</w:t>
+        <w:t>-</w:t>
       </w:r>
       <w:r>
         <w:rPr>
@@ -2193,602 +2816,6 @@
           <w:sz w:val="28"/>
           <w:szCs w:val="28"/>
         </w:rPr>
-        <w:t>-145:</w:t>
-      </w:r>
-    </w:p>
-    <w:p>
-      <w:pPr>
-        <w:rPr>
-          <w:rFonts w:ascii="Arial Black" w:hAnsi="Arial Black"/>
-          <w:b/>
-          <w:bCs/>
-          <w:sz w:val="28"/>
-          <w:szCs w:val="28"/>
-        </w:rPr>
-      </w:pPr>
-      <w:r>
-        <w:rPr>
-          <w:b/>
-          <w:bCs/>
-          <w:sz w:val="28"/>
-          <w:szCs w:val="28"/>
-        </w:rPr>
-        <w:t>2006/2312:</w:t>
-      </w:r>
-      <w:r>
-        <w:rPr>
-          <w:sz w:val="28"/>
-          <w:szCs w:val="28"/>
-        </w:rPr>
-        <w:t xml:space="preserve"> 2 katha, 03 dhur (Riyasat Miyan se vainama liya gaya)</w:t>
-      </w:r>
-    </w:p>
-    <w:p>
-      <w:pPr>
-        <w:rPr>
-          <w:sz w:val="28"/>
-          <w:szCs w:val="28"/>
-        </w:rPr>
-      </w:pPr>
-    </w:p>
-    <w:p>
-      <w:pPr>
-        <w:rPr>
-          <w:sz w:val="28"/>
-          <w:szCs w:val="28"/>
-        </w:rPr>
-      </w:pPr>
-      <w:r>
-        <w:rPr>
-          <w:b/>
-          <w:bCs/>
-          <w:sz w:val="28"/>
-          <w:szCs w:val="28"/>
-        </w:rPr>
-        <w:t>767:</w:t>
-      </w:r>
-      <w:r>
-        <w:rPr>
-          <w:sz w:val="28"/>
-          <w:szCs w:val="28"/>
-        </w:rPr>
-        <w:t xml:space="preserve"> 6 katha, 09 dhur = 24 dismil</w:t>
-      </w:r>
-    </w:p>
-    <w:p>
-      <w:pPr>
-        <w:ind w:left="720"/>
-        <w:rPr>
-          <w:sz w:val="28"/>
-          <w:szCs w:val="28"/>
-        </w:rPr>
-      </w:pPr>
-      <w:r>
-        <w:rPr>
-          <w:b/>
-          <w:bCs/>
-          <w:sz w:val="28"/>
-          <w:szCs w:val="28"/>
-        </w:rPr>
-        <w:t>N:</w:t>
-      </w:r>
-      <w:r>
-        <w:rPr>
-          <w:sz w:val="28"/>
-          <w:szCs w:val="28"/>
-        </w:rPr>
-        <w:t xml:space="preserve"> Chand Govind Pathak</w:t>
-      </w:r>
-    </w:p>
-    <w:p>
-      <w:pPr>
-        <w:ind w:left="720"/>
-        <w:rPr>
-          <w:sz w:val="28"/>
-          <w:szCs w:val="28"/>
-        </w:rPr>
-      </w:pPr>
-      <w:r>
-        <w:rPr>
-          <w:b/>
-          <w:bCs/>
-          <w:sz w:val="28"/>
-          <w:szCs w:val="28"/>
-        </w:rPr>
-        <w:t>S:</w:t>
-      </w:r>
-      <w:r>
-        <w:rPr>
-          <w:sz w:val="28"/>
-          <w:szCs w:val="28"/>
-        </w:rPr>
-        <w:t xml:space="preserve"> Baldev Barai</w:t>
-      </w:r>
-    </w:p>
-    <w:p>
-      <w:pPr>
-        <w:ind w:left="720"/>
-        <w:rPr>
-          <w:sz w:val="28"/>
-          <w:szCs w:val="28"/>
-        </w:rPr>
-      </w:pPr>
-      <w:r>
-        <w:rPr>
-          <w:b/>
-          <w:bCs/>
-          <w:sz w:val="28"/>
-          <w:szCs w:val="28"/>
-        </w:rPr>
-        <w:t>E:</w:t>
-      </w:r>
-      <w:r>
-        <w:rPr>
-          <w:sz w:val="28"/>
-          <w:szCs w:val="28"/>
-        </w:rPr>
-        <w:t xml:space="preserve"> Fatigan Miyan</w:t>
-      </w:r>
-    </w:p>
-    <w:p>
-      <w:pPr>
-        <w:ind w:left="720"/>
-        <w:rPr>
-          <w:sz w:val="28"/>
-          <w:szCs w:val="28"/>
-        </w:rPr>
-      </w:pPr>
-      <w:r>
-        <w:rPr>
-          <w:b/>
-          <w:bCs/>
-          <w:sz w:val="28"/>
-          <w:szCs w:val="28"/>
-        </w:rPr>
-        <w:t>W:</w:t>
-      </w:r>
-      <w:r>
-        <w:rPr>
-          <w:sz w:val="28"/>
-          <w:szCs w:val="28"/>
-        </w:rPr>
-        <w:t xml:space="preserve"> Tulsi Barai</w:t>
-      </w:r>
-    </w:p>
-    <w:p>
-      <w:pPr>
-        <w:ind w:left="720"/>
-        <w:rPr>
-          <w:sz w:val="28"/>
-          <w:szCs w:val="28"/>
-        </w:rPr>
-      </w:pPr>
-    </w:p>
-    <w:p>
-      <w:pPr>
-        <w:rPr>
-          <w:sz w:val="28"/>
-          <w:szCs w:val="28"/>
-        </w:rPr>
-      </w:pPr>
-      <w:r>
-        <w:rPr>
-          <w:b/>
-          <w:bCs/>
-          <w:sz w:val="28"/>
-          <w:szCs w:val="28"/>
-        </w:rPr>
-        <w:t>770:</w:t>
-      </w:r>
-      <w:r>
-        <w:rPr>
-          <w:sz w:val="28"/>
-          <w:szCs w:val="28"/>
-        </w:rPr>
-        <w:t xml:space="preserve"> 1 katha, 07 dhur = 5 dismil</w:t>
-      </w:r>
-    </w:p>
-    <w:p>
-      <w:pPr>
-        <w:ind w:left="720"/>
-        <w:rPr>
-          <w:sz w:val="28"/>
-          <w:szCs w:val="28"/>
-        </w:rPr>
-      </w:pPr>
-      <w:r>
-        <w:rPr>
-          <w:b/>
-          <w:bCs/>
-          <w:sz w:val="28"/>
-          <w:szCs w:val="28"/>
-        </w:rPr>
-        <w:t>N:</w:t>
-      </w:r>
-      <w:r>
-        <w:rPr>
-          <w:sz w:val="28"/>
-          <w:szCs w:val="28"/>
-        </w:rPr>
-        <w:t xml:space="preserve"> Fatigan Miyan</w:t>
-      </w:r>
-    </w:p>
-    <w:p>
-      <w:pPr>
-        <w:ind w:left="720"/>
-        <w:rPr>
-          <w:sz w:val="28"/>
-          <w:szCs w:val="28"/>
-        </w:rPr>
-      </w:pPr>
-      <w:r>
-        <w:rPr>
-          <w:b/>
-          <w:bCs/>
-          <w:sz w:val="28"/>
-          <w:szCs w:val="28"/>
-        </w:rPr>
-        <w:t>S:</w:t>
-      </w:r>
-      <w:r>
-        <w:rPr>
-          <w:sz w:val="28"/>
-          <w:szCs w:val="28"/>
-        </w:rPr>
-        <w:t xml:space="preserve"> Fatigan Miyan</w:t>
-      </w:r>
-    </w:p>
-    <w:p>
-      <w:pPr>
-        <w:ind w:left="720"/>
-        <w:rPr>
-          <w:sz w:val="28"/>
-          <w:szCs w:val="28"/>
-        </w:rPr>
-      </w:pPr>
-      <w:r>
-        <w:rPr>
-          <w:b/>
-          <w:bCs/>
-          <w:sz w:val="28"/>
-          <w:szCs w:val="28"/>
-        </w:rPr>
-        <w:t>E:</w:t>
-      </w:r>
-      <w:r>
-        <w:rPr>
-          <w:sz w:val="28"/>
-          <w:szCs w:val="28"/>
-        </w:rPr>
-        <w:t xml:space="preserve"> Suba Miyan</w:t>
-      </w:r>
-    </w:p>
-    <w:p>
-      <w:pPr>
-        <w:ind w:left="720"/>
-        <w:rPr>
-          <w:sz w:val="28"/>
-          <w:szCs w:val="28"/>
-        </w:rPr>
-      </w:pPr>
-      <w:r>
-        <w:rPr>
-          <w:b/>
-          <w:bCs/>
-          <w:sz w:val="28"/>
-          <w:szCs w:val="28"/>
-        </w:rPr>
-        <w:t>W:</w:t>
-      </w:r>
-      <w:r>
-        <w:rPr>
-          <w:sz w:val="28"/>
-          <w:szCs w:val="28"/>
-        </w:rPr>
-        <w:t xml:space="preserve"> Baldev Barai</w:t>
-      </w:r>
-    </w:p>
-    <w:p>
-      <w:pPr>
-        <w:rPr>
-          <w:sz w:val="28"/>
-          <w:szCs w:val="28"/>
-        </w:rPr>
-      </w:pPr>
-      <w:r>
-        <w:rPr>
-          <w:b/>
-          <w:bCs/>
-          <w:sz w:val="28"/>
-          <w:szCs w:val="28"/>
-        </w:rPr>
-        <w:lastRenderedPageBreak/>
-        <w:t>2058:</w:t>
-      </w:r>
-      <w:r>
-        <w:rPr>
-          <w:sz w:val="28"/>
-          <w:szCs w:val="28"/>
-        </w:rPr>
-        <w:t xml:space="preserve"> 1 katha, 18 dhur = 7 dismil</w:t>
-      </w:r>
-    </w:p>
-    <w:p>
-      <w:pPr>
-        <w:ind w:left="720"/>
-        <w:rPr>
-          <w:sz w:val="28"/>
-          <w:szCs w:val="28"/>
-        </w:rPr>
-      </w:pPr>
-      <w:r>
-        <w:rPr>
-          <w:b/>
-          <w:bCs/>
-          <w:sz w:val="28"/>
-          <w:szCs w:val="28"/>
-        </w:rPr>
-        <w:t>N:</w:t>
-      </w:r>
-      <w:r>
-        <w:rPr>
-          <w:sz w:val="28"/>
-          <w:szCs w:val="28"/>
-        </w:rPr>
-        <w:t xml:space="preserve"> Dukhi Miyan</w:t>
-      </w:r>
-    </w:p>
-    <w:p>
-      <w:pPr>
-        <w:ind w:left="720"/>
-        <w:rPr>
-          <w:sz w:val="28"/>
-          <w:szCs w:val="28"/>
-        </w:rPr>
-      </w:pPr>
-      <w:r>
-        <w:rPr>
-          <w:b/>
-          <w:bCs/>
-          <w:sz w:val="28"/>
-          <w:szCs w:val="28"/>
-        </w:rPr>
-        <w:t>S:</w:t>
-      </w:r>
-      <w:r>
-        <w:rPr>
-          <w:sz w:val="28"/>
-          <w:szCs w:val="28"/>
-        </w:rPr>
-        <w:t xml:space="preserve"> Suba Miyan</w:t>
-      </w:r>
-    </w:p>
-    <w:p>
-      <w:pPr>
-        <w:ind w:left="720"/>
-        <w:rPr>
-          <w:sz w:val="28"/>
-          <w:szCs w:val="28"/>
-        </w:rPr>
-      </w:pPr>
-      <w:r>
-        <w:rPr>
-          <w:b/>
-          <w:bCs/>
-          <w:sz w:val="28"/>
-          <w:szCs w:val="28"/>
-        </w:rPr>
-        <w:t>E:</w:t>
-      </w:r>
-      <w:r>
-        <w:rPr>
-          <w:sz w:val="28"/>
-          <w:szCs w:val="28"/>
-        </w:rPr>
-        <w:t xml:space="preserve"> Fatigan Miyan</w:t>
-      </w:r>
-    </w:p>
-    <w:p>
-      <w:pPr>
-        <w:ind w:left="720"/>
-        <w:rPr>
-          <w:sz w:val="28"/>
-          <w:szCs w:val="28"/>
-        </w:rPr>
-      </w:pPr>
-      <w:r>
-        <w:rPr>
-          <w:b/>
-          <w:bCs/>
-          <w:sz w:val="28"/>
-          <w:szCs w:val="28"/>
-        </w:rPr>
-        <w:t>W:</w:t>
-      </w:r>
-      <w:r>
-        <w:rPr>
-          <w:sz w:val="28"/>
-          <w:szCs w:val="28"/>
-        </w:rPr>
-        <w:t xml:space="preserve"> Fatigan Miyan</w:t>
-      </w:r>
-    </w:p>
-    <w:p>
-      <w:pPr>
-        <w:rPr>
-          <w:sz w:val="28"/>
-          <w:szCs w:val="28"/>
-        </w:rPr>
-      </w:pPr>
-    </w:p>
-    <w:p>
-      <w:pPr>
-        <w:rPr>
-          <w:sz w:val="28"/>
-          <w:szCs w:val="28"/>
-        </w:rPr>
-      </w:pPr>
-      <w:r>
-        <w:rPr>
-          <w:b/>
-          <w:bCs/>
-          <w:sz w:val="28"/>
-          <w:szCs w:val="28"/>
-        </w:rPr>
-        <w:t>2063:</w:t>
-      </w:r>
-      <w:r>
-        <w:rPr>
-          <w:sz w:val="28"/>
-          <w:szCs w:val="28"/>
-        </w:rPr>
-        <w:t xml:space="preserve"> 16 dhur = 3 dismil</w:t>
-      </w:r>
-    </w:p>
-    <w:p>
-      <w:pPr>
-        <w:ind w:left="720"/>
-        <w:rPr>
-          <w:sz w:val="28"/>
-          <w:szCs w:val="28"/>
-        </w:rPr>
-      </w:pPr>
-      <w:r>
-        <w:rPr>
-          <w:b/>
-          <w:bCs/>
-          <w:sz w:val="28"/>
-          <w:szCs w:val="28"/>
-        </w:rPr>
-        <w:t>N:</w:t>
-      </w:r>
-      <w:r>
-        <w:rPr>
-          <w:sz w:val="28"/>
-          <w:szCs w:val="28"/>
-        </w:rPr>
-        <w:t xml:space="preserve"> Dukhi Miyan</w:t>
-      </w:r>
-    </w:p>
-    <w:p>
-      <w:pPr>
-        <w:ind w:left="720"/>
-        <w:rPr>
-          <w:sz w:val="28"/>
-          <w:szCs w:val="28"/>
-        </w:rPr>
-      </w:pPr>
-      <w:r>
-        <w:rPr>
-          <w:b/>
-          <w:bCs/>
-          <w:sz w:val="28"/>
-          <w:szCs w:val="28"/>
-        </w:rPr>
-        <w:t>S:</w:t>
-      </w:r>
-      <w:r>
-        <w:rPr>
-          <w:sz w:val="28"/>
-          <w:szCs w:val="28"/>
-        </w:rPr>
-        <w:t xml:space="preserve"> Jagdev Tiwari</w:t>
-      </w:r>
-    </w:p>
-    <w:p>
-      <w:pPr>
-        <w:ind w:left="720"/>
-        <w:rPr>
-          <w:sz w:val="28"/>
-          <w:szCs w:val="28"/>
-        </w:rPr>
-      </w:pPr>
-      <w:r>
-        <w:rPr>
-          <w:b/>
-          <w:bCs/>
-          <w:sz w:val="28"/>
-          <w:szCs w:val="28"/>
-        </w:rPr>
-        <w:t>E:</w:t>
-      </w:r>
-      <w:r>
-        <w:rPr>
-          <w:sz w:val="28"/>
-          <w:szCs w:val="28"/>
-        </w:rPr>
-        <w:t xml:space="preserve"> Suba Miyan</w:t>
-      </w:r>
-    </w:p>
-    <w:p>
-      <w:pPr>
-        <w:ind w:left="720"/>
-        <w:rPr>
-          <w:sz w:val="28"/>
-          <w:szCs w:val="28"/>
-        </w:rPr>
-      </w:pPr>
-      <w:r>
-        <w:rPr>
-          <w:b/>
-          <w:bCs/>
-          <w:sz w:val="28"/>
-          <w:szCs w:val="28"/>
-        </w:rPr>
-        <w:t>W:</w:t>
-      </w:r>
-      <w:r>
-        <w:rPr>
-          <w:sz w:val="28"/>
-          <w:szCs w:val="28"/>
-        </w:rPr>
-        <w:t xml:space="preserve"> Raghpal Rai</w:t>
-      </w:r>
-    </w:p>
-    <w:p>
-      <w:pPr>
-        <w:rPr>
-          <w:sz w:val="28"/>
-          <w:szCs w:val="28"/>
-        </w:rPr>
-      </w:pPr>
-    </w:p>
-    <w:p>
-      <w:pPr>
-        <w:rPr>
-          <w:rFonts w:ascii="Arial Black" w:hAnsi="Arial Black"/>
-          <w:b/>
-          <w:bCs/>
-          <w:sz w:val="28"/>
-          <w:szCs w:val="28"/>
-        </w:rPr>
-      </w:pPr>
-      <w:r>
-        <w:rPr>
-          <w:rFonts w:ascii="Arial Black" w:hAnsi="Arial Black" w:cs="Nirmala UI"/>
-          <w:sz w:val="28"/>
-          <w:szCs w:val="28"/>
-        </w:rPr>
-        <w:t>Khata</w:t>
-      </w:r>
-      <w:r>
-        <w:rPr>
-          <w:rFonts w:ascii="Arial Black" w:hAnsi="Arial Black"/>
-          <w:b/>
-          <w:bCs/>
-          <w:sz w:val="28"/>
-          <w:szCs w:val="28"/>
-        </w:rPr>
-        <w:t>-</w:t>
-      </w:r>
-      <w:r>
-        <w:rPr>
-          <w:rFonts w:ascii="Arial Black" w:hAnsi="Arial Black"/>
-          <w:b/>
-          <w:bCs/>
-          <w:sz w:val="28"/>
-          <w:szCs w:val="28"/>
-        </w:rPr>
         <w:t>254:</w:t>
       </w:r>
     </w:p>
@@ -2813,23 +2840,7 @@
           <w:sz w:val="28"/>
           <w:szCs w:val="28"/>
         </w:rPr>
-        <w:t xml:space="preserve"> 1 Bigha, 2 katha, 12 dhur = 84 dismil / 2 (</w:t>
-      </w:r>
-      <w:proofErr w:type="spellStart"/>
-      <w:r>
-        <w:rPr>
-          <w:sz w:val="28"/>
-          <w:szCs w:val="28"/>
-        </w:rPr>
-        <w:t>Najru</w:t>
-      </w:r>
-      <w:proofErr w:type="spellEnd"/>
-      <w:r>
-        <w:rPr>
-          <w:sz w:val="28"/>
-          <w:szCs w:val="28"/>
-        </w:rPr>
-        <w:t xml:space="preserve"> Miyan and Riyasat Miyan)</w:t>
+        <w:t xml:space="preserve"> 1 Bigha, 2 katha, 12 dhur = 84 dismil / 2 (Najru Miyan and Riyasat Miyan)</w:t>
       </w:r>
     </w:p>
     <w:p>

</xml_diff>